<commit_message>
docs: actualizar arquitectura hibrida y evidencias CAPSTONE
</commit_message>
<xml_diff>
--- a/Evidencias CAPSTONE/Fase 1/Evidencias de proyecto/Documento_Avance_Sprint_1_Alunza.docx
+++ b/Evidencias CAPSTONE/Fase 1/Evidencias de proyecto/Documento_Avance_Sprint_1_Alunza.docx
@@ -12,10 +12,6 @@
         </w:rPr>
       </w:pPr>
       <w:r>
-        <w:rPr>
-          <w:rFonts w:ascii="Tahoma" w:hAnsi="Tahoma"/>
-          <w:i w:val="0"/>
-        </w:rPr>
         <w:t>Informe de avance Sprint 1 - Alunza</w:t>
       </w:r>
     </w:p>
@@ -35,7 +31,7 @@
       </w:tblGrid>
       <w:tr>
         <w:trPr>
-          <w:cnfStyle w:val="000000100000" w:firstRow="0" w:lastRow="0" w:firstColumn="0" w:lastColumn="0" w:oddVBand="0" w:evenVBand="0" w:oddHBand="1" w:evenHBand="0" w:firstRowFirstColumn="0" w:firstRowLastColumn="0" w:lastRowFirstColumn="0" w:lastRowLastColumn="0"/>
+          <w:tblHeader/>
         </w:trPr>
         <w:tc>
           <w:tcPr>
@@ -56,93 +52,6 @@
                 <w:sz w:val="19"/>
               </w:rPr>
               <w:t>Informe de avance</w:t>
-            </w:r>
-          </w:p>
-        </w:tc>
-      </w:tr>
-      <w:tr>
-        <w:tc>
-          <w:tcPr>
-            <w:cnfStyle w:val="000010000000" w:firstRow="0" w:lastRow="0" w:firstColumn="0" w:lastColumn="0" w:oddVBand="1" w:evenVBand="0" w:oddHBand="0" w:evenHBand="0" w:firstRowFirstColumn="0" w:firstRowLastColumn="0" w:lastRowFirstColumn="0" w:lastRowLastColumn="0"/>
-            <w:tcW w:w="1276" w:type="dxa"/>
-            <w:vAlign w:val="center"/>
-          </w:tcPr>
-          <w:p>
-            <w:pPr>
-              <w:jc w:val="center"/>
-            </w:pPr>
-            <w:r>
-              <w:rPr>
-                <w:rFonts w:ascii="Tahoma" w:hAnsi="Tahoma"/>
-                <w:b/>
-                <w:i w:val="0"/>
-                <w:sz w:val="17"/>
-              </w:rPr>
-              <w:t>N°</w:t>
-            </w:r>
-          </w:p>
-        </w:tc>
-        <w:tc>
-          <w:tcPr>
-            <w:tcW w:w="1276" w:type="dxa"/>
-            <w:vAlign w:val="center"/>
-          </w:tcPr>
-          <w:p>
-            <w:pPr>
-              <w:jc w:val="center"/>
-              <w:cnfStyle w:val="000000000000" w:firstRow="0" w:lastRow="0" w:firstColumn="0" w:lastColumn="0" w:oddVBand="0" w:evenVBand="0" w:oddHBand="0" w:evenHBand="0" w:firstRowFirstColumn="0" w:firstRowLastColumn="0" w:lastRowFirstColumn="0" w:lastRowLastColumn="0"/>
-            </w:pPr>
-            <w:r>
-              <w:rPr>
-                <w:rFonts w:ascii="Tahoma" w:hAnsi="Tahoma"/>
-                <w:b/>
-                <w:i w:val="0"/>
-                <w:sz w:val="17"/>
-              </w:rPr>
-              <w:t>Versión</w:t>
-            </w:r>
-          </w:p>
-        </w:tc>
-        <w:tc>
-          <w:tcPr>
-            <w:cnfStyle w:val="000010000000" w:firstRow="0" w:lastRow="0" w:firstColumn="0" w:lastColumn="0" w:oddVBand="1" w:evenVBand="0" w:oddHBand="0" w:evenHBand="0" w:firstRowFirstColumn="0" w:firstRowLastColumn="0" w:lastRowFirstColumn="0" w:lastRowLastColumn="0"/>
-            <w:tcW w:w="5104" w:type="dxa"/>
-            <w:gridSpan w:val="2"/>
-            <w:vAlign w:val="center"/>
-          </w:tcPr>
-          <w:p>
-            <w:pPr>
-              <w:jc w:val="center"/>
-            </w:pPr>
-            <w:r>
-              <w:rPr>
-                <w:rFonts w:ascii="Tahoma" w:hAnsi="Tahoma"/>
-                <w:b/>
-                <w:i w:val="0"/>
-                <w:sz w:val="17"/>
-              </w:rPr>
-              <w:t>Descripción</w:t>
-            </w:r>
-          </w:p>
-        </w:tc>
-        <w:tc>
-          <w:tcPr>
-            <w:tcW w:w="2692" w:type="dxa"/>
-            <w:vAlign w:val="center"/>
-          </w:tcPr>
-          <w:p>
-            <w:pPr>
-              <w:jc w:val="center"/>
-              <w:cnfStyle w:val="000000000000" w:firstRow="0" w:lastRow="0" w:firstColumn="0" w:lastColumn="0" w:oddVBand="0" w:evenVBand="0" w:oddHBand="0" w:evenHBand="0" w:firstRowFirstColumn="0" w:firstRowLastColumn="0" w:lastRowFirstColumn="0" w:lastRowLastColumn="0"/>
-            </w:pPr>
-            <w:r>
-              <w:rPr>
-                <w:rFonts w:ascii="Tahoma" w:hAnsi="Tahoma"/>
-                <w:b/>
-                <w:i w:val="0"/>
-                <w:sz w:val="17"/>
-              </w:rPr>
-              <w:t>Autor</w:t>
             </w:r>
           </w:p>
         </w:tc>
@@ -164,10 +73,11 @@
             <w:r>
               <w:rPr>
                 <w:rFonts w:ascii="Tahoma" w:hAnsi="Tahoma"/>
+                <w:b/>
                 <w:i w:val="0"/>
                 <w:sz w:val="17"/>
               </w:rPr>
-              <w:t>ALZ-AV-001</w:t>
+              <w:t>N°</w:t>
             </w:r>
           </w:p>
         </w:tc>
@@ -184,10 +94,11 @@
             <w:r>
               <w:rPr>
                 <w:rFonts w:ascii="Tahoma" w:hAnsi="Tahoma"/>
+                <w:b/>
                 <w:i w:val="0"/>
                 <w:sz w:val="17"/>
               </w:rPr>
-              <w:t>1.0</w:t>
+              <w:t>Versión</w:t>
             </w:r>
           </w:p>
         </w:tc>
@@ -199,45 +110,6 @@
             <w:vAlign w:val="center"/>
           </w:tcPr>
           <w:p>
-            <w:r>
-              <w:rPr>
-                <w:rFonts w:ascii="Tahoma" w:hAnsi="Tahoma"/>
-                <w:i w:val="0"/>
-                <w:sz w:val="17"/>
-              </w:rPr>
-              <w:t>Estado del Sprint 1: definición y diseño</w:t>
-            </w:r>
-          </w:p>
-        </w:tc>
-        <w:tc>
-          <w:tcPr>
-            <w:tcW w:w="2692" w:type="dxa"/>
-            <w:vAlign w:val="center"/>
-          </w:tcPr>
-          <w:p>
-            <w:pPr>
-              <w:cnfStyle w:val="000000100000" w:firstRow="0" w:lastRow="0" w:firstColumn="0" w:lastColumn="0" w:oddVBand="0" w:evenVBand="0" w:oddHBand="1" w:evenHBand="0" w:firstRowFirstColumn="0" w:firstRowLastColumn="0" w:lastRowFirstColumn="0" w:lastRowLastColumn="0"/>
-            </w:pPr>
-            <w:r>
-              <w:rPr>
-                <w:rFonts w:ascii="Tahoma" w:hAnsi="Tahoma"/>
-                <w:i w:val="0"/>
-                <w:sz w:val="16"/>
-              </w:rPr>
-              <w:t>Equipo Alunza: Benjamin Pérez, Abraham Retamal y Marcelo Núñez</w:t>
-            </w:r>
-          </w:p>
-        </w:tc>
-      </w:tr>
-      <w:tr>
-        <w:tc>
-          <w:tcPr>
-            <w:cnfStyle w:val="000010000000" w:firstRow="0" w:lastRow="0" w:firstColumn="0" w:lastColumn="0" w:oddVBand="1" w:evenVBand="0" w:oddHBand="0" w:evenHBand="0" w:firstRowFirstColumn="0" w:firstRowLastColumn="0" w:lastRowFirstColumn="0" w:lastRowLastColumn="0"/>
-            <w:tcW w:w="2552" w:type="dxa"/>
-            <w:gridSpan w:val="2"/>
-            <w:vAlign w:val="center"/>
-          </w:tcPr>
-          <w:p>
             <w:pPr>
               <w:jc w:val="center"/>
             </w:pPr>
@@ -248,19 +120,19 @@
                 <w:i w:val="0"/>
                 <w:sz w:val="17"/>
               </w:rPr>
-              <w:t>Fecha</w:t>
-            </w:r>
-          </w:p>
-        </w:tc>
-        <w:tc>
-          <w:tcPr>
-            <w:tcW w:w="2693" w:type="dxa"/>
+              <w:t>Descripción</w:t>
+            </w:r>
+          </w:p>
+        </w:tc>
+        <w:tc>
+          <w:tcPr>
+            <w:tcW w:w="2692" w:type="dxa"/>
             <w:vAlign w:val="center"/>
           </w:tcPr>
           <w:p>
             <w:pPr>
               <w:jc w:val="center"/>
-              <w:cnfStyle w:val="000000000000" w:firstRow="0" w:lastRow="0" w:firstColumn="0" w:lastColumn="0" w:oddVBand="0" w:evenVBand="0" w:oddHBand="0" w:evenHBand="0" w:firstRowFirstColumn="0" w:firstRowLastColumn="0" w:lastRowFirstColumn="0" w:lastRowLastColumn="0"/>
+              <w:cnfStyle w:val="000000100000" w:firstRow="0" w:lastRow="0" w:firstColumn="0" w:lastColumn="0" w:oddVBand="0" w:evenVBand="0" w:oddHBand="1" w:evenHBand="0" w:firstRowFirstColumn="0" w:firstRowLastColumn="0" w:lastRowFirstColumn="0" w:lastRowLastColumn="0"/>
             </w:pPr>
             <w:r>
               <w:rPr>
@@ -269,15 +141,16 @@
                 <w:i w:val="0"/>
                 <w:sz w:val="17"/>
               </w:rPr>
-              <w:t>Ubicación</w:t>
-            </w:r>
-          </w:p>
-        </w:tc>
+              <w:t>Autor</w:t>
+            </w:r>
+          </w:p>
+        </w:tc>
+      </w:tr>
+      <w:tr>
         <w:tc>
           <w:tcPr>
             <w:cnfStyle w:val="000010000000" w:firstRow="0" w:lastRow="0" w:firstColumn="0" w:lastColumn="0" w:oddVBand="1" w:evenVBand="0" w:oddHBand="0" w:evenHBand="0" w:firstRowFirstColumn="0" w:firstRowLastColumn="0" w:lastRowFirstColumn="0" w:lastRowLastColumn="0"/>
-            <w:tcW w:w="5103" w:type="dxa"/>
-            <w:gridSpan w:val="2"/>
+            <w:tcW w:w="1276" w:type="dxa"/>
             <w:vAlign w:val="center"/>
           </w:tcPr>
           <w:p>
@@ -287,11 +160,56 @@
             <w:r>
               <w:rPr>
                 <w:rFonts w:ascii="Tahoma" w:hAnsi="Tahoma"/>
-                <w:b/>
                 <w:i w:val="0"/>
                 <w:sz w:val="17"/>
               </w:rPr>
-              <w:t>Proyecto</w:t>
+              <w:t>ALZ-AV-001</w:t>
+            </w:r>
+          </w:p>
+        </w:tc>
+        <w:tc>
+          <w:tcPr>
+            <w:tcW w:w="1276" w:type="dxa"/>
+            <w:vAlign w:val="center"/>
+          </w:tcPr>
+          <w:p>
+            <w:pPr>
+              <w:cnfStyle w:val="000000000000" w:firstRow="0" w:lastRow="0" w:firstColumn="0" w:lastColumn="0" w:oddVBand="0" w:evenVBand="0" w:oddHBand="0" w:evenHBand="0" w:firstRowFirstColumn="0" w:firstRowLastColumn="0" w:lastRowFirstColumn="0" w:lastRowLastColumn="0"/>
+            </w:pPr>
+            <w:r>
+              <w:t>1.2</w:t>
+            </w:r>
+          </w:p>
+        </w:tc>
+        <w:tc>
+          <w:tcPr>
+            <w:cnfStyle w:val="000010000000" w:firstRow="0" w:lastRow="0" w:firstColumn="0" w:lastColumn="0" w:oddVBand="1" w:evenVBand="0" w:oddHBand="0" w:evenHBand="0" w:firstRowFirstColumn="0" w:firstRowLastColumn="0" w:lastRowFirstColumn="0" w:lastRowLastColumn="0"/>
+            <w:tcW w:w="5104" w:type="dxa"/>
+            <w:gridSpan w:val="2"/>
+            <w:vAlign w:val="center"/>
+          </w:tcPr>
+          <w:p>
+            <w:r>
+              <w:t>Cierre documental del Sprint 1 y revisión técnica del 04/09/2026; sin implementación acreditada</w:t>
+            </w:r>
+          </w:p>
+        </w:tc>
+        <w:tc>
+          <w:tcPr>
+            <w:tcW w:w="2692" w:type="dxa"/>
+            <w:vAlign w:val="center"/>
+          </w:tcPr>
+          <w:p>
+            <w:pPr>
+              <w:cnfStyle w:val="000000000000" w:firstRow="0" w:lastRow="0" w:firstColumn="0" w:lastColumn="0" w:oddVBand="0" w:evenVBand="0" w:oddHBand="0" w:evenHBand="0" w:firstRowFirstColumn="0" w:firstRowLastColumn="0" w:lastRowFirstColumn="0" w:lastRowLastColumn="0"/>
+            </w:pPr>
+            <w:r>
+              <w:rPr>
+                <w:rFonts w:ascii="Tahoma" w:hAnsi="Tahoma"/>
+                <w:i w:val="0"/>
+                <w:sz w:val="16"/>
+              </w:rPr>
+              <w:t>Equipo Alunza: Benjamin Pérez, Abraham Retamal y Marcelo Núñez</w:t>
             </w:r>
           </w:p>
         </w:tc>
@@ -314,10 +232,11 @@
             <w:r>
               <w:rPr>
                 <w:rFonts w:ascii="Tahoma" w:hAnsi="Tahoma"/>
+                <w:b/>
                 <w:i w:val="0"/>
                 <w:sz w:val="17"/>
               </w:rPr>
-              <w:t>01/09/2026</w:t>
+              <w:t>Fecha</w:t>
             </w:r>
           </w:p>
         </w:tc>
@@ -330,6 +249,64 @@
             <w:pPr>
               <w:jc w:val="center"/>
               <w:cnfStyle w:val="000000100000" w:firstRow="0" w:lastRow="0" w:firstColumn="0" w:lastColumn="0" w:oddVBand="0" w:evenVBand="0" w:oddHBand="1" w:evenHBand="0" w:firstRowFirstColumn="0" w:firstRowLastColumn="0" w:lastRowFirstColumn="0" w:lastRowLastColumn="0"/>
+            </w:pPr>
+            <w:r>
+              <w:rPr>
+                <w:rFonts w:ascii="Tahoma" w:hAnsi="Tahoma"/>
+                <w:b/>
+                <w:i w:val="0"/>
+                <w:sz w:val="17"/>
+              </w:rPr>
+              <w:t>Ubicación</w:t>
+            </w:r>
+          </w:p>
+        </w:tc>
+        <w:tc>
+          <w:tcPr>
+            <w:cnfStyle w:val="000010000000" w:firstRow="0" w:lastRow="0" w:firstColumn="0" w:lastColumn="0" w:oddVBand="1" w:evenVBand="0" w:oddHBand="0" w:evenHBand="0" w:firstRowFirstColumn="0" w:firstRowLastColumn="0" w:lastRowFirstColumn="0" w:lastRowLastColumn="0"/>
+            <w:tcW w:w="5103" w:type="dxa"/>
+            <w:gridSpan w:val="2"/>
+            <w:vAlign w:val="center"/>
+          </w:tcPr>
+          <w:p>
+            <w:pPr>
+              <w:jc w:val="center"/>
+            </w:pPr>
+            <w:r>
+              <w:rPr>
+                <w:rFonts w:ascii="Tahoma" w:hAnsi="Tahoma"/>
+                <w:b/>
+                <w:i w:val="0"/>
+                <w:sz w:val="17"/>
+              </w:rPr>
+              <w:t>Proyecto</w:t>
+            </w:r>
+          </w:p>
+        </w:tc>
+      </w:tr>
+      <w:tr>
+        <w:tc>
+          <w:tcPr>
+            <w:cnfStyle w:val="000010000000" w:firstRow="0" w:lastRow="0" w:firstColumn="0" w:lastColumn="0" w:oddVBand="1" w:evenVBand="0" w:oddHBand="0" w:evenHBand="0" w:firstRowFirstColumn="0" w:firstRowLastColumn="0" w:lastRowFirstColumn="0" w:lastRowLastColumn="0"/>
+            <w:tcW w:w="2552" w:type="dxa"/>
+            <w:gridSpan w:val="2"/>
+            <w:vAlign w:val="center"/>
+          </w:tcPr>
+          <w:p>
+            <w:r>
+              <w:t>02/09/2026; revisión técnica 04/09/2026</w:t>
+            </w:r>
+          </w:p>
+        </w:tc>
+        <w:tc>
+          <w:tcPr>
+            <w:tcW w:w="2693" w:type="dxa"/>
+            <w:vAlign w:val="center"/>
+          </w:tcPr>
+          <w:p>
+            <w:pPr>
+              <w:jc w:val="center"/>
+              <w:cnfStyle w:val="000000000000" w:firstRow="0" w:lastRow="0" w:firstColumn="0" w:lastColumn="0" w:oddVBand="0" w:evenVBand="0" w:oddHBand="0" w:evenHBand="0" w:firstRowFirstColumn="0" w:firstRowLastColumn="0" w:lastRowFirstColumn="0" w:lastRowLastColumn="0"/>
             </w:pPr>
             <w:r>
               <w:rPr>
@@ -388,8 +365,8 @@
       </w:tblGrid>
       <w:tr>
         <w:trPr>
-          <w:cnfStyle w:val="000000100000" w:firstRow="0" w:lastRow="0" w:firstColumn="0" w:lastColumn="0" w:oddVBand="0" w:evenVBand="0" w:oddHBand="1" w:evenHBand="0" w:firstRowFirstColumn="0" w:firstRowLastColumn="0" w:lastRowFirstColumn="0" w:lastRowLastColumn="0"/>
           <w:trHeight w:val="300"/>
+          <w:tblHeader/>
         </w:trPr>
         <w:tc>
           <w:tcPr>
@@ -422,6 +399,7 @@
       <w:tr>
         <w:trPr>
           <w:trHeight w:val="510"/>
+          <w:tblHeader/>
         </w:trPr>
         <w:tc>
           <w:tcPr>
@@ -429,47 +407,29 @@
             <w:tcW w:w="3970" w:type="dxa"/>
           </w:tcPr>
           <w:p>
+            <w:r>
+              <w:rPr>
+                <w:b/>
+                <w:sz w:val="17"/>
+              </w:rPr>
+              <w:t>Nombre</w:t>
+            </w:r>
+          </w:p>
+        </w:tc>
+        <w:tc>
+          <w:tcPr>
+            <w:tcW w:w="1559" w:type="dxa"/>
+          </w:tcPr>
+          <w:p>
             <w:pPr>
-              <w:jc w:val="center"/>
-              <w:rPr>
-                <w:rFonts w:ascii="Tahoma" w:eastAsia="Arial Unicode MS" w:hAnsi="Tahoma" w:cs="Tahoma"/>
+              <w:cnfStyle w:val="000000000000" w:firstRow="0" w:lastRow="0" w:firstColumn="0" w:lastColumn="0" w:oddVBand="0" w:evenVBand="0" w:oddHBand="0" w:evenHBand="0" w:firstRowFirstColumn="0" w:firstRowLastColumn="0" w:lastRowFirstColumn="0" w:lastRowLastColumn="0"/>
+            </w:pPr>
+            <w:r>
+              <w:rPr>
                 <w:b/>
-                <w:bCs/>
-              </w:rPr>
-            </w:pPr>
-            <w:r>
-              <w:rPr>
-                <w:rFonts w:ascii="Tahoma" w:hAnsi="Tahoma" w:cs="Tahoma"/>
-                <w:b/>
-                <w:bCs/>
-                <w:szCs w:val="22"/>
-              </w:rPr>
-              <w:t>Nombre</w:t>
-            </w:r>
-          </w:p>
-        </w:tc>
-        <w:tc>
-          <w:tcPr>
-            <w:tcW w:w="1559" w:type="dxa"/>
-          </w:tcPr>
-          <w:p>
-            <w:pPr>
-              <w:jc w:val="center"/>
-              <w:cnfStyle w:val="000000000000" w:firstRow="0" w:lastRow="0" w:firstColumn="0" w:lastColumn="0" w:oddVBand="0" w:evenVBand="0" w:oddHBand="0" w:evenHBand="0" w:firstRowFirstColumn="0" w:firstRowLastColumn="0" w:lastRowFirstColumn="0" w:lastRowLastColumn="0"/>
-              <w:rPr>
-                <w:rFonts w:ascii="Tahoma" w:eastAsia="Arial Unicode MS" w:hAnsi="Tahoma" w:cs="Tahoma"/>
-                <w:b/>
-                <w:bCs/>
-              </w:rPr>
-            </w:pPr>
-            <w:r>
-              <w:rPr>
-                <w:rFonts w:ascii="Tahoma" w:hAnsi="Tahoma" w:cs="Tahoma"/>
-                <w:b/>
-                <w:bCs/>
-                <w:szCs w:val="22"/>
-              </w:rPr>
-              <w:t>Empresa</w:t>
+                <w:sz w:val="17"/>
+              </w:rPr>
+              <w:t>Rol</w:t>
             </w:r>
           </w:p>
         </w:tc>
@@ -479,47 +439,29 @@
             <w:tcW w:w="1559" w:type="dxa"/>
           </w:tcPr>
           <w:p>
+            <w:r>
+              <w:rPr>
+                <w:b/>
+                <w:sz w:val="17"/>
+              </w:rPr>
+              <w:t>Responsabilidad principal</w:t>
+            </w:r>
+          </w:p>
+        </w:tc>
+        <w:tc>
+          <w:tcPr>
+            <w:tcW w:w="3260" w:type="dxa"/>
+          </w:tcPr>
+          <w:p>
             <w:pPr>
-              <w:jc w:val="center"/>
-              <w:rPr>
-                <w:rFonts w:ascii="Tahoma" w:eastAsia="Arial Unicode MS" w:hAnsi="Tahoma" w:cs="Tahoma"/>
+              <w:cnfStyle w:val="000000000000" w:firstRow="0" w:lastRow="0" w:firstColumn="0" w:lastColumn="0" w:oddVBand="0" w:evenVBand="0" w:oddHBand="0" w:evenHBand="0" w:firstRowFirstColumn="0" w:firstRowLastColumn="0" w:lastRowFirstColumn="0" w:lastRowLastColumn="0"/>
+            </w:pPr>
+            <w:r>
+              <w:rPr>
                 <w:b/>
-                <w:bCs/>
-              </w:rPr>
-            </w:pPr>
-            <w:r>
-              <w:rPr>
-                <w:rFonts w:ascii="Tahoma" w:hAnsi="Tahoma" w:cs="Tahoma"/>
-                <w:b/>
-                <w:bCs/>
-                <w:szCs w:val="22"/>
-              </w:rPr>
-              <w:t>Teléfono</w:t>
-            </w:r>
-          </w:p>
-        </w:tc>
-        <w:tc>
-          <w:tcPr>
-            <w:tcW w:w="3260" w:type="dxa"/>
-          </w:tcPr>
-          <w:p>
-            <w:pPr>
-              <w:jc w:val="center"/>
-              <w:cnfStyle w:val="000000000000" w:firstRow="0" w:lastRow="0" w:firstColumn="0" w:lastColumn="0" w:oddVBand="0" w:evenVBand="0" w:oddHBand="0" w:evenHBand="0" w:firstRowFirstColumn="0" w:firstRowLastColumn="0" w:lastRowFirstColumn="0" w:lastRowLastColumn="0"/>
-              <w:rPr>
-                <w:rFonts w:ascii="Tahoma" w:eastAsia="Arial Unicode MS" w:hAnsi="Tahoma" w:cs="Tahoma"/>
-                <w:b/>
-                <w:bCs/>
-              </w:rPr>
-            </w:pPr>
-            <w:r>
-              <w:rPr>
-                <w:rFonts w:ascii="Tahoma" w:hAnsi="Tahoma" w:cs="Tahoma"/>
-                <w:b/>
-                <w:bCs/>
-                <w:szCs w:val="22"/>
-              </w:rPr>
-              <w:t>e-mail</w:t>
+                <w:sz w:val="17"/>
+              </w:rPr>
+              <w:t>Evidencia de participación</w:t>
             </w:r>
           </w:p>
         </w:tc>
@@ -538,9 +480,7 @@
           <w:p>
             <w:r>
               <w:rPr>
-                <w:rFonts w:ascii="Tahoma" w:hAnsi="Tahoma"/>
-                <w:i w:val="0"/>
-                <w:sz w:val="16"/>
+                <w:sz w:val="17"/>
               </w:rPr>
               <w:t>Benjamin Pérez</w:t>
             </w:r>
@@ -558,11 +498,9 @@
             </w:pPr>
             <w:r>
               <w:rPr>
-                <w:rFonts w:ascii="Tahoma" w:hAnsi="Tahoma"/>
-                <w:i w:val="0"/>
-                <w:sz w:val="16"/>
-              </w:rPr>
-              <w:t>Duoc UC, sede Puente Alto</w:t>
+                <w:sz w:val="17"/>
+              </w:rPr>
+              <w:t>Integrante</w:t>
             </w:r>
           </w:p>
         </w:tc>
@@ -576,11 +514,9 @@
           <w:p>
             <w:r>
               <w:rPr>
-                <w:rFonts w:ascii="Tahoma" w:hAnsi="Tahoma"/>
-                <w:i w:val="0"/>
-                <w:sz w:val="16"/>
-              </w:rPr>
-              <w:t>+56 9 6123 4501</w:t>
+                <w:sz w:val="17"/>
+              </w:rPr>
+              <w:t>UX/UI, frontend y documentación</w:t>
             </w:r>
           </w:p>
         </w:tc>
@@ -596,11 +532,9 @@
             </w:pPr>
             <w:r>
               <w:rPr>
-                <w:rFonts w:ascii="Tahoma" w:hAnsi="Tahoma"/>
-                <w:i w:val="0"/>
-                <w:sz w:val="16"/>
-              </w:rPr>
-              <w:t>benjamin.perez@alunza.cl</w:t>
+                <w:sz w:val="17"/>
+              </w:rPr>
+              <w:t>Revisión documental y retrospectiva registradas</w:t>
             </w:r>
           </w:p>
         </w:tc>
@@ -618,9 +552,7 @@
           <w:p>
             <w:r>
               <w:rPr>
-                <w:rFonts w:ascii="Tahoma" w:hAnsi="Tahoma"/>
-                <w:i w:val="0"/>
-                <w:sz w:val="16"/>
+                <w:sz w:val="17"/>
               </w:rPr>
               <w:t>Abraham Retamal</w:t>
             </w:r>
@@ -638,11 +570,9 @@
             </w:pPr>
             <w:r>
               <w:rPr>
-                <w:rFonts w:ascii="Tahoma" w:hAnsi="Tahoma"/>
-                <w:i w:val="0"/>
-                <w:sz w:val="16"/>
-              </w:rPr>
-              <w:t>Duoc UC, sede Puente Alto</w:t>
+                <w:sz w:val="17"/>
+              </w:rPr>
+              <w:t>Integrante</w:t>
             </w:r>
           </w:p>
         </w:tc>
@@ -656,11 +586,9 @@
           <w:p>
             <w:r>
               <w:rPr>
-                <w:rFonts w:ascii="Tahoma" w:hAnsi="Tahoma"/>
-                <w:i w:val="0"/>
-                <w:sz w:val="16"/>
-              </w:rPr>
-              <w:t>+56 9 6123 4502</w:t>
+                <w:sz w:val="17"/>
+              </w:rPr>
+              <w:t>Datos, IA/RAG y calidad</w:t>
             </w:r>
           </w:p>
         </w:tc>
@@ -676,11 +604,9 @@
             </w:pPr>
             <w:r>
               <w:rPr>
-                <w:rFonts w:ascii="Tahoma" w:hAnsi="Tahoma"/>
-                <w:i w:val="0"/>
-                <w:sz w:val="16"/>
-              </w:rPr>
-              <w:t>abraham.retamal@alunza.cl</w:t>
+                <w:sz w:val="17"/>
+              </w:rPr>
+              <w:t>Revisión documental y retrospectiva registradas</w:t>
             </w:r>
           </w:p>
         </w:tc>
@@ -699,9 +625,7 @@
           <w:p>
             <w:r>
               <w:rPr>
-                <w:rFonts w:ascii="Tahoma" w:hAnsi="Tahoma"/>
-                <w:i w:val="0"/>
-                <w:sz w:val="16"/>
+                <w:sz w:val="17"/>
               </w:rPr>
               <w:t>Marcelo Núñez</w:t>
             </w:r>
@@ -719,11 +643,9 @@
             </w:pPr>
             <w:r>
               <w:rPr>
-                <w:rFonts w:ascii="Tahoma" w:hAnsi="Tahoma"/>
-                <w:i w:val="0"/>
-                <w:sz w:val="16"/>
-              </w:rPr>
-              <w:t>Duoc UC, sede Puente Alto</w:t>
+                <w:sz w:val="17"/>
+              </w:rPr>
+              <w:t>Product Owner</w:t>
             </w:r>
           </w:p>
         </w:tc>
@@ -737,11 +659,9 @@
           <w:p>
             <w:r>
               <w:rPr>
-                <w:rFonts w:ascii="Tahoma" w:hAnsi="Tahoma"/>
-                <w:i w:val="0"/>
-                <w:sz w:val="16"/>
-              </w:rPr>
-              <w:t>+56 9 6123 4503</w:t>
+                <w:sz w:val="17"/>
+              </w:rPr>
+              <w:t>Backend e integración</w:t>
             </w:r>
           </w:p>
         </w:tc>
@@ -757,80 +677,10 @@
             </w:pPr>
             <w:r>
               <w:rPr>
-                <w:rFonts w:ascii="Tahoma" w:hAnsi="Tahoma"/>
-                <w:i w:val="0"/>
-                <w:sz w:val="16"/>
-              </w:rPr>
-              <w:t>marcelo.nunez@alunza.cl</w:t>
-            </w:r>
-          </w:p>
-        </w:tc>
-      </w:tr>
-      <w:tr>
-        <w:trPr>
-          <w:trHeight w:val="255"/>
-        </w:trPr>
-        <w:tc>
-          <w:tcPr>
-            <w:cnfStyle w:val="000010000000" w:firstRow="0" w:lastRow="0" w:firstColumn="0" w:lastColumn="0" w:oddVBand="1" w:evenVBand="0" w:oddHBand="0" w:evenHBand="0" w:firstRowFirstColumn="0" w:firstRowLastColumn="0" w:lastRowFirstColumn="0" w:lastRowLastColumn="0"/>
-            <w:tcW w:w="3970" w:type="dxa"/>
-          </w:tcPr>
-          <w:p>
-            <w:pPr>
-              <w:jc w:val="center"/>
-              <w:rPr>
-                <w:rFonts w:ascii="Arial" w:eastAsia="Arial Unicode MS" w:hAnsi="Arial" w:cs="Arial"/>
-                <w:lang w:val="fr-FR"/>
-              </w:rPr>
-            </w:pPr>
-          </w:p>
-        </w:tc>
-        <w:tc>
-          <w:tcPr>
-            <w:tcW w:w="1559" w:type="dxa"/>
-            <w:noWrap/>
-          </w:tcPr>
-          <w:p>
-            <w:pPr>
-              <w:cnfStyle w:val="000000000000" w:firstRow="0" w:lastRow="0" w:firstColumn="0" w:lastColumn="0" w:oddVBand="0" w:evenVBand="0" w:oddHBand="0" w:evenHBand="0" w:firstRowFirstColumn="0" w:firstRowLastColumn="0" w:lastRowFirstColumn="0" w:lastRowLastColumn="0"/>
-              <w:rPr>
-                <w:rFonts w:ascii="Tahoma" w:hAnsi="Tahoma" w:cs="Tahoma"/>
-                <w:lang w:val="fr-FR"/>
-              </w:rPr>
-            </w:pPr>
-          </w:p>
-        </w:tc>
-        <w:tc>
-          <w:tcPr>
-            <w:cnfStyle w:val="000010000000" w:firstRow="0" w:lastRow="0" w:firstColumn="0" w:lastColumn="0" w:oddVBand="1" w:evenVBand="0" w:oddHBand="0" w:evenHBand="0" w:firstRowFirstColumn="0" w:firstRowLastColumn="0" w:lastRowFirstColumn="0" w:lastRowLastColumn="0"/>
-            <w:tcW w:w="1559" w:type="dxa"/>
-            <w:noWrap/>
-          </w:tcPr>
-          <w:p>
-            <w:pPr>
-              <w:jc w:val="right"/>
-              <w:rPr>
-                <w:rFonts w:ascii="Tahoma" w:hAnsi="Tahoma" w:cs="Tahoma"/>
-                <w:lang w:val="fr-FR"/>
-              </w:rPr>
-            </w:pPr>
-          </w:p>
-        </w:tc>
-        <w:tc>
-          <w:tcPr>
-            <w:tcW w:w="3260" w:type="dxa"/>
-            <w:noWrap/>
-          </w:tcPr>
-          <w:p>
-            <w:pPr>
-              <w:cnfStyle w:val="000000000000" w:firstRow="0" w:lastRow="0" w:firstColumn="0" w:lastColumn="0" w:oddVBand="0" w:evenVBand="0" w:oddHBand="0" w:evenHBand="0" w:firstRowFirstColumn="0" w:firstRowLastColumn="0" w:lastRowFirstColumn="0" w:lastRowLastColumn="0"/>
-              <w:rPr>
-                <w:rFonts w:ascii="Tahoma" w:hAnsi="Tahoma" w:cs="Tahoma"/>
-                <w:color w:val="0000FF"/>
-                <w:u w:val="single"/>
-                <w:lang w:val="fr-FR"/>
-              </w:rPr>
-            </w:pPr>
+                <w:sz w:val="17"/>
+              </w:rPr>
+              <w:t>Revisión documental y retrospectiva registradas</w:t>
+            </w:r>
           </w:p>
         </w:tc>
       </w:tr>
@@ -907,12 +757,7 @@
         <w:spacing w:after="100" w:line="259" w:lineRule="auto"/>
       </w:pPr>
       <w:r>
-        <w:rPr>
-          <w:rFonts w:ascii="Tahoma" w:hAnsi="Tahoma"/>
-          <w:i w:val="0"/>
-          <w:sz w:val="19"/>
-        </w:rPr>
-        <w:t>Alunza es una plataforma web B2B orientada a instituciones de educación superior. Su MVP apoyará la enseñanza de Programación I con JavaScript mediante clases y actividades, ejecución controlada de código, casos de prueba deterministas, feedback progresivo, un RAG mínimo basado en material oficial y un tablero docente con evidencia explicable. Los usuarios primarios son profesor y estudiante; la solución apoyará la decisión pedagógica sin reemplazar al docente ni depender exclusivamente de un LLM.</w:t>
+        <w:t>Alunza es una plataforma web B2B para Programación I con JavaScript. El administrador gobierna de forma acotada organizaciones, usuarios, cursos y reglas; el profesor prepara clases y actividades; y el estudiante ejecuta código, recibe evidencia y reintenta. La evaluación es determinista y la IA/RAG apoya con material oficial sin reemplazar la decisión pedagógica.</w:t>
       </w:r>
     </w:p>
     <w:p>
@@ -929,12 +774,7 @@
         <w:spacing w:after="100" w:line="259" w:lineRule="auto"/>
       </w:pPr>
       <w:r>
-        <w:rPr>
-          <w:rFonts w:ascii="Tahoma" w:hAnsi="Tahoma"/>
-          <w:i w:val="0"/>
-          <w:sz w:val="19"/>
-        </w:rPr>
-        <w:t>Este documento registra el avance acumulado de los Sprints 0 y 1 de definición, correspondientes a las semanas 1-4 del plan CAPSTONE, con corte al 01/09/2026. El Sprint 0 cubrió alineamiento y riesgos durante las semanas 1-2; el Sprint 1 cubre alcance y diseño durante las semanas 3-4. El resultado observable es una línea base documental y de planificación; la implementación comenzará con el Sprint 2.</w:t>
+        <w:t>Este documento registra el cierre documental de los Sprints 0 y 1 de definición, correspondientes a las semanas 1-4 del plan CAPSTONE, con corte administrativo al 02/09/2026. La revisión técnica del 04/09/2026 incorporó AD-ARQ-001 y actualizó la arquitectura sin cambiar los estados históricos. El resultado observable es una línea base de documentación y planificación. No se afirma la existencia de software implementado; el desarrollo comienza con el Sprint 2.</w:t>
       </w:r>
     </w:p>
     <w:p>
@@ -948,13 +788,7 @@
         <w:spacing w:after="50" w:line="252" w:lineRule="auto"/>
       </w:pPr>
       <w:r>
-        <w:rPr>
-          <w:rFonts w:ascii="Tahoma" w:hAnsi="Tahoma"/>
-          <w:b/>
-          <w:i w:val="0"/>
-          <w:sz w:val="19"/>
-        </w:rPr>
-        <w:t>Estado: Sprint 1 en curso; no corresponde declararlo cerrado hasta completar la revisión de la semana 4.</w:t>
+        <w:t>Estado: Sprint 1 cerrado para efectos de la entrega documental al 02/09/2026; el cierre no equivale a incremento de software ni a pruebas técnicas ejecutadas.</w:t>
       </w:r>
     </w:p>
     <w:p>
@@ -968,13 +802,7 @@
         <w:spacing w:after="50" w:line="252" w:lineRule="auto"/>
       </w:pPr>
       <w:r>
-        <w:rPr>
-          <w:rFonts w:ascii="Tahoma" w:hAnsi="Tahoma"/>
-          <w:b/>
-          <w:i w:val="0"/>
-          <w:sz w:val="19"/>
-        </w:rPr>
-        <w:t>Entregables consolidados: Acta de Constitución, ERS, casos de uso, historias, Product Backlog, Sprint Backlog, Roadmap ágil, presentación Fase 1 y retrospectiva.</w:t>
+        <w:t>Entregables consolidados documentalmente: Acta de Constitución, ERS, casos de uso, historias, Product Backlog, Sprint Backlog, Roadmap ágil, presentación Fase 1 y retrospectiva. Los estados específicos se detallan en la tabla de avance.</w:t>
       </w:r>
     </w:p>
     <w:p>
@@ -988,21 +816,7 @@
         <w:spacing w:after="50" w:line="252" w:lineRule="auto"/>
       </w:pPr>
       <w:r>
-        <w:rPr>
-          <w:rFonts w:ascii="Tahoma" w:hAnsi="Tahoma"/>
-          <w:b/>
-          <w:i w:val="0"/>
-          <w:sz w:val="19"/>
-        </w:rPr>
-        <w:t>Alcance acordado:</w:t>
-      </w:r>
-      <w:r>
-        <w:rPr>
-          <w:rFonts w:ascii="Tahoma" w:hAnsi="Tahoma"/>
-          <w:i w:val="0"/>
-          <w:sz w:val="19"/>
-        </w:rPr>
-        <w:t xml:space="preserve"> una vertical demostrable para Programación I con JavaScript, evaluación determinista primero y apoyo de IA/RAG acotado.</w:t>
+        <w:t>Alcance acordado: una vertical demostrable para Programación I con JavaScript, evaluación determinista primero y apoyo acotado de IA/RAG.</w:t>
       </w:r>
     </w:p>
     <w:p>
@@ -1016,21 +830,7 @@
         <w:spacing w:after="50" w:line="252" w:lineRule="auto"/>
       </w:pPr>
       <w:r>
-        <w:rPr>
-          <w:rFonts w:ascii="Tahoma" w:hAnsi="Tahoma"/>
-          <w:b/>
-          <w:i w:val="0"/>
-          <w:sz w:val="19"/>
-        </w:rPr>
-        <w:t>Medición:</w:t>
-      </w:r>
-      <w:r>
-        <w:rPr>
-          <w:rFonts w:ascii="Tahoma" w:hAnsi="Tahoma"/>
-          <w:i w:val="0"/>
-          <w:sz w:val="19"/>
-        </w:rPr>
-        <w:t xml:space="preserve"> no se informa porcentaje global ni velocidad porque aún no existe registro verificable de código integrado, horas consumidas o historias terminadas.</w:t>
+        <w:t>Medición: porcentaje global, velocidad, horas consumidas y métricas de calidad permanecen como N/D porque al corte no existe evidencia verificable de código integrado, horas registradas, historias implementadas ni pruebas ejecutadas.</w:t>
       </w:r>
     </w:p>
     <w:p>
@@ -1044,21 +844,7 @@
         <w:spacing w:after="50" w:line="252" w:lineRule="auto"/>
       </w:pPr>
       <w:r>
-        <w:rPr>
-          <w:rFonts w:ascii="Tahoma" w:hAnsi="Tahoma"/>
-          <w:b/>
-          <w:i w:val="0"/>
-          <w:sz w:val="19"/>
-        </w:rPr>
-        <w:t>Riesgo inmediato:</w:t>
-      </w:r>
-      <w:r>
-        <w:rPr>
-          <w:rFonts w:ascii="Tahoma" w:hAnsi="Tahoma"/>
-          <w:i w:val="0"/>
-          <w:sz w:val="19"/>
-        </w:rPr>
-        <w:t xml:space="preserve"> faltan evidencias de los spikes del ejecutor JavaScript y del RAG previstos para la fase inicial.</w:t>
+        <w:t>Riesgo inmediato: no existe todavía evidencia operativa del Vercel Sandbox, RLS ni del flujo RAG. Sprint 2 validará seguridad, latencia, costo, límites y región sin reabrir AD-ARQ-001.</w:t>
       </w:r>
     </w:p>
     <w:p>
@@ -1277,17 +1063,13 @@
           </w:tcPr>
           <w:p>
             <w:pPr>
-              <w:jc w:val="center"/>
               <w:cnfStyle w:val="000000100000" w:firstRow="0" w:lastRow="0" w:firstColumn="0" w:lastColumn="0" w:oddVBand="0" w:evenVBand="0" w:oddHBand="1" w:evenHBand="0" w:firstRowFirstColumn="0" w:firstRowLastColumn="0" w:lastRowFirstColumn="0" w:lastRowLastColumn="0"/>
             </w:pPr>
             <w:r>
               <w:rPr>
-                <w:rFonts w:ascii="Tahoma" w:hAnsi="Tahoma"/>
-                <w:b/>
-                <w:i w:val="0"/>
-                <w:sz w:val="16"/>
-              </w:rPr>
-              <w:t>Completada</w:t>
+                <w:sz w:val="17"/>
+              </w:rPr>
+              <w:t>Consolidada</w:t>
             </w:r>
           </w:p>
         </w:tc>
@@ -1308,11 +1090,9 @@
             </w:pPr>
             <w:r>
               <w:rPr>
-                <w:rFonts w:ascii="Tahoma" w:hAnsi="Tahoma"/>
-                <w:i w:val="0"/>
-                <w:sz w:val="15"/>
-              </w:rPr>
-              <w:t>Acta_de_Constitucion_Alunza.docx, versión 1.1.</w:t>
+                <w:sz w:val="16"/>
+              </w:rPr>
+              <w:t>Acta de Constitución, versión 1.3; cierre documental 02/09/2026 y revisión técnica 04/09/2026.</w:t>
             </w:r>
           </w:p>
         </w:tc>
@@ -1383,17 +1163,13 @@
           </w:tcPr>
           <w:p>
             <w:pPr>
-              <w:jc w:val="center"/>
               <w:cnfStyle w:val="000000000000" w:firstRow="0" w:lastRow="0" w:firstColumn="0" w:lastColumn="0" w:oddVBand="0" w:evenVBand="0" w:oddHBand="0" w:evenHBand="0" w:firstRowFirstColumn="0" w:firstRowLastColumn="0" w:lastRowFirstColumn="0" w:lastRowLastColumn="0"/>
             </w:pPr>
             <w:r>
               <w:rPr>
-                <w:rFonts w:ascii="Tahoma" w:hAnsi="Tahoma"/>
-                <w:b/>
-                <w:i w:val="0"/>
-                <w:sz w:val="16"/>
-              </w:rPr>
-              <w:t>Completada</w:t>
+                <w:sz w:val="17"/>
+              </w:rPr>
+              <w:t>Consolidada</w:t>
             </w:r>
           </w:p>
         </w:tc>
@@ -1414,11 +1190,9 @@
             </w:pPr>
             <w:r>
               <w:rPr>
-                <w:rFonts w:ascii="Tahoma" w:hAnsi="Tahoma"/>
-                <w:i w:val="0"/>
-                <w:sz w:val="15"/>
-              </w:rPr>
-              <w:t>Roadmap_Agil_Alunza_2026.pptx, con nueve sprints de dos semanas.</w:t>
+                <w:sz w:val="16"/>
+              </w:rPr>
+              <w:t>Roadmap ágil con nueve sprints de dos semanas.</w:t>
             </w:r>
           </w:p>
         </w:tc>
@@ -1492,17 +1266,13 @@
           </w:tcPr>
           <w:p>
             <w:pPr>
-              <w:jc w:val="center"/>
               <w:cnfStyle w:val="000000100000" w:firstRow="0" w:lastRow="0" w:firstColumn="0" w:lastColumn="0" w:oddVBand="0" w:evenVBand="0" w:oddHBand="1" w:evenHBand="0" w:firstRowFirstColumn="0" w:firstRowLastColumn="0" w:lastRowFirstColumn="0" w:lastRowLastColumn="0"/>
             </w:pPr>
             <w:r>
               <w:rPr>
-                <w:rFonts w:ascii="Tahoma" w:hAnsi="Tahoma"/>
-                <w:b/>
-                <w:i w:val="0"/>
-                <w:sz w:val="16"/>
-              </w:rPr>
-              <w:t>Completada</w:t>
+                <w:sz w:val="17"/>
+              </w:rPr>
+              <w:t>Consolidada</w:t>
             </w:r>
           </w:p>
         </w:tc>
@@ -1523,11 +1293,9 @@
             </w:pPr>
             <w:r>
               <w:rPr>
-                <w:rFonts w:ascii="Tahoma" w:hAnsi="Tahoma"/>
-                <w:i w:val="0"/>
-                <w:sz w:val="15"/>
-              </w:rPr>
-              <w:t>Informe ERS de Alunza.</w:t>
+                <w:sz w:val="16"/>
+              </w:rPr>
+              <w:t>ERS versión 1.3; requisitos y arquitectura especificados, aún no implementados.</w:t>
             </w:r>
           </w:p>
         </w:tc>
@@ -1598,17 +1366,13 @@
           </w:tcPr>
           <w:p>
             <w:pPr>
-              <w:jc w:val="center"/>
               <w:cnfStyle w:val="000000000000" w:firstRow="0" w:lastRow="0" w:firstColumn="0" w:lastColumn="0" w:oddVBand="0" w:evenVBand="0" w:oddHBand="0" w:evenHBand="0" w:firstRowFirstColumn="0" w:firstRowLastColumn="0" w:lastRowFirstColumn="0" w:lastRowLastColumn="0"/>
             </w:pPr>
             <w:r>
               <w:rPr>
-                <w:rFonts w:ascii="Tahoma" w:hAnsi="Tahoma"/>
-                <w:b/>
-                <w:i w:val="0"/>
-                <w:sz w:val="16"/>
-              </w:rPr>
-              <w:t>Completada</w:t>
+                <w:sz w:val="17"/>
+              </w:rPr>
+              <w:t>Consolidada</w:t>
             </w:r>
           </w:p>
         </w:tc>
@@ -1629,11 +1393,9 @@
             </w:pPr>
             <w:r>
               <w:rPr>
-                <w:rFonts w:ascii="Tahoma" w:hAnsi="Tahoma"/>
-                <w:i w:val="0"/>
-                <w:sz w:val="15"/>
-              </w:rPr>
-              <w:t>Casos de uso extendidos y 19 historias priorizadas.</w:t>
+                <w:sz w:val="16"/>
+              </w:rPr>
+              <w:t>Casos de uso extendidos y trazabilidad de 27 ALZ-RF/ALZ-HU/ALZ-CU/ALZ-PT.</w:t>
             </w:r>
           </w:p>
         </w:tc>
@@ -1711,17 +1473,13 @@
           </w:tcPr>
           <w:p>
             <w:pPr>
-              <w:jc w:val="center"/>
               <w:cnfStyle w:val="000000100000" w:firstRow="0" w:lastRow="0" w:firstColumn="0" w:lastColumn="0" w:oddVBand="0" w:evenVBand="0" w:oddHBand="1" w:evenHBand="0" w:firstRowFirstColumn="0" w:firstRowLastColumn="0" w:lastRowFirstColumn="0" w:lastRowLastColumn="0"/>
             </w:pPr>
             <w:r>
               <w:rPr>
-                <w:rFonts w:ascii="Tahoma" w:hAnsi="Tahoma"/>
-                <w:b/>
-                <w:i w:val="0"/>
-                <w:sz w:val="16"/>
-              </w:rPr>
-              <w:t>Completada</w:t>
+                <w:sz w:val="17"/>
+              </w:rPr>
+              <w:t>Consolidada</w:t>
             </w:r>
           </w:p>
         </w:tc>
@@ -1742,11 +1500,9 @@
             </w:pPr>
             <w:r>
               <w:rPr>
-                <w:rFonts w:ascii="Tahoma" w:hAnsi="Tahoma"/>
-                <w:i w:val="0"/>
-                <w:sz w:val="15"/>
-              </w:rPr>
-              <w:t>Product Backlog alineado a S0-S8; Sprint 2 con 12 tareas y 84 horas.</w:t>
+                <w:sz w:val="16"/>
+              </w:rPr>
+              <w:t>Product Backlog con 27 historias y 184 puntos; Sprint Backlog 2 planificado con 12 tareas/60 h.</w:t>
             </w:r>
           </w:p>
         </w:tc>
@@ -1817,15 +1573,11 @@
           </w:tcPr>
           <w:p>
             <w:pPr>
-              <w:jc w:val="center"/>
               <w:cnfStyle w:val="000000000000" w:firstRow="0" w:lastRow="0" w:firstColumn="0" w:lastColumn="0" w:oddVBand="0" w:evenVBand="0" w:oddHBand="0" w:evenHBand="0" w:firstRowFirstColumn="0" w:firstRowLastColumn="0" w:lastRowFirstColumn="0" w:lastRowLastColumn="0"/>
             </w:pPr>
             <w:r>
               <w:rPr>
-                <w:rFonts w:ascii="Tahoma" w:hAnsi="Tahoma"/>
-                <w:b/>
-                <w:i w:val="0"/>
-                <w:sz w:val="16"/>
+                <w:sz w:val="17"/>
               </w:rPr>
               <w:t>Parcial</w:t>
             </w:r>
@@ -1848,11 +1600,9 @@
             </w:pPr>
             <w:r>
               <w:rPr>
-                <w:rFonts w:ascii="Tahoma" w:hAnsi="Tahoma"/>
-                <w:i w:val="0"/>
-                <w:sz w:val="15"/>
-              </w:rPr>
-              <w:t>Existe arquitectura conceptual; diagramas y prototipos requieren validación.</w:t>
+                <w:sz w:val="16"/>
+              </w:rPr>
+              <w:t>Arquitectura híbrida definida; validación operativa y de usuarios pendiente para los prototipos.</w:t>
             </w:r>
           </w:p>
         </w:tc>
@@ -1909,7 +1659,7 @@
                 <w:i w:val="0"/>
                 <w:sz w:val="16"/>
               </w:rPr>
-              <w:t>Realizar spikes de ejecutor JavaScript y RAG</w:t>
+              <w:t>Validar Vercel Sandbox, RLS y RAG</w:t>
             </w:r>
           </w:p>
         </w:tc>
@@ -1926,15 +1676,11 @@
           </w:tcPr>
           <w:p>
             <w:pPr>
-              <w:jc w:val="center"/>
               <w:cnfStyle w:val="000000100000" w:firstRow="0" w:lastRow="0" w:firstColumn="0" w:lastColumn="0" w:oddVBand="0" w:evenVBand="0" w:oddHBand="1" w:evenHBand="0" w:firstRowFirstColumn="0" w:firstRowLastColumn="0" w:lastRowFirstColumn="0" w:lastRowLastColumn="0"/>
             </w:pPr>
             <w:r>
               <w:rPr>
-                <w:rFonts w:ascii="Tahoma" w:hAnsi="Tahoma"/>
-                <w:b/>
-                <w:i w:val="0"/>
-                <w:sz w:val="16"/>
+                <w:sz w:val="17"/>
               </w:rPr>
               <w:t>Pendiente</w:t>
             </w:r>
@@ -1957,11 +1703,9 @@
             </w:pPr>
             <w:r>
               <w:rPr>
-                <w:rFonts w:ascii="Tahoma" w:hAnsi="Tahoma"/>
-                <w:i w:val="0"/>
-                <w:sz w:val="15"/>
-              </w:rPr>
-              <w:t>No se dispone de evidencia técnica; priorizar antes de comprometer la arquitectura.</w:t>
+                <w:sz w:val="16"/>
+              </w:rPr>
+              <w:t>Sin evidencia operativa al corte; medir seguridad, p95, región, costo y límites sin reabrir la arquitectura.</w:t>
             </w:r>
           </w:p>
         </w:tc>
@@ -2032,17 +1776,13 @@
           </w:tcPr>
           <w:p>
             <w:pPr>
-              <w:jc w:val="center"/>
               <w:cnfStyle w:val="000000000000" w:firstRow="0" w:lastRow="0" w:firstColumn="0" w:lastColumn="0" w:oddVBand="0" w:evenVBand="0" w:oddHBand="0" w:evenHBand="0" w:firstRowFirstColumn="0" w:firstRowLastColumn="0" w:lastRowFirstColumn="0" w:lastRowLastColumn="0"/>
             </w:pPr>
             <w:r>
               <w:rPr>
-                <w:rFonts w:ascii="Tahoma" w:hAnsi="Tahoma"/>
-                <w:b/>
-                <w:i w:val="0"/>
-                <w:sz w:val="16"/>
-              </w:rPr>
-              <w:t>Completada</w:t>
+                <w:sz w:val="17"/>
+              </w:rPr>
+              <w:t>Documentada</w:t>
             </w:r>
           </w:p>
         </w:tc>
@@ -2063,11 +1803,9 @@
             </w:pPr>
             <w:r>
               <w:rPr>
-                <w:rFonts w:ascii="Tahoma" w:hAnsi="Tahoma"/>
-                <w:i w:val="0"/>
-                <w:sz w:val="15"/>
-              </w:rPr>
-              <w:t>Roles, tecnologías, despliegue y proveedor de IA confirmados en la línea base 1.1.</w:t>
+                <w:sz w:val="16"/>
+              </w:rPr>
+              <w:t>Roles y arquitectura definitiva documentados; su implementación y validación siguen pendientes.</w:t>
             </w:r>
           </w:p>
         </w:tc>
@@ -2141,17 +1879,13 @@
           </w:tcPr>
           <w:p>
             <w:pPr>
-              <w:jc w:val="center"/>
               <w:cnfStyle w:val="000000100000" w:firstRow="0" w:lastRow="0" w:firstColumn="0" w:lastColumn="0" w:oddVBand="0" w:evenVBand="0" w:oddHBand="1" w:evenHBand="0" w:firstRowFirstColumn="0" w:firstRowLastColumn="0" w:lastRowFirstColumn="0" w:lastRowLastColumn="0"/>
             </w:pPr>
             <w:r>
               <w:rPr>
-                <w:rFonts w:ascii="Tahoma" w:hAnsi="Tahoma"/>
-                <w:b/>
-                <w:i w:val="0"/>
-                <w:sz w:val="16"/>
-              </w:rPr>
-              <w:t>Completada</w:t>
+                <w:sz w:val="17"/>
+              </w:rPr>
+              <w:t>Registrada</w:t>
             </w:r>
           </w:p>
         </w:tc>
@@ -2172,11 +1906,9 @@
             </w:pPr>
             <w:r>
               <w:rPr>
-                <w:rFonts w:ascii="Tahoma" w:hAnsi="Tahoma"/>
-                <w:i w:val="0"/>
-                <w:sz w:val="15"/>
-              </w:rPr>
-              <w:t>Reunion realizada, asistentes registrados y acuerdos validados.</w:t>
+                <w:sz w:val="16"/>
+              </w:rPr>
+              <w:t>Retrospectiva disponible; no constituye evidencia de implementación.</w:t>
             </w:r>
           </w:p>
         </w:tc>
@@ -2189,12 +1921,7 @@
         <w:spacing w:before="140" w:after="60"/>
       </w:pPr>
       <w:r>
-        <w:rPr>
-          <w:rFonts w:ascii="Tahoma" w:hAnsi="Tahoma"/>
-          <w:i w:val="0"/>
-          <w:sz w:val="21"/>
-        </w:rPr>
-        <w:t>Acciones para cerrar el Sprint 1</w:t>
+        <w:t>Pendientes trasladados al Sprint 2</w:t>
       </w:r>
     </w:p>
     <w:p>
@@ -2208,12 +1935,7 @@
         <w:spacing w:after="50" w:line="252" w:lineRule="auto"/>
       </w:pPr>
       <w:r>
-        <w:rPr>
-          <w:rFonts w:ascii="Tahoma" w:hAnsi="Tahoma"/>
-          <w:i w:val="0"/>
-          <w:sz w:val="19"/>
-        </w:rPr>
-        <w:t>Propagar en todos los artefactos la distribución confirmada de roles: Marcelo Núñez en Product Owner, backend e integración; Benjamin Pérez en UX/UI, frontend y documentación; Abraham Retamal en datos, IA/RAG y calidad.</w:t>
+        <w:t>Mantener la distribución común de roles: Marcelo Núñez en Product Owner, backend e integración; Benjamin Pérez en UX/UI, frontend y documentación; Abraham Retamal en datos, IA/RAG y calidad.</w:t>
       </w:r>
     </w:p>
     <w:p>
@@ -2227,12 +1949,7 @@
         <w:spacing w:after="50" w:line="252" w:lineRule="auto"/>
       </w:pPr>
       <w:r>
-        <w:rPr>
-          <w:rFonts w:ascii="Tahoma" w:hAnsi="Tahoma"/>
-          <w:i w:val="0"/>
-          <w:sz w:val="19"/>
-        </w:rPr>
-        <w:t>Usar de forma definitiva la denominación Alunza - Tutor Universitario Inteligente para Programación I y mantener acordada la titularidad del código y su uso académico.</w:t>
+        <w:t>Mantener la denominación Alunza - Tutor Universitario Inteligente para Programación I y registrar por separado cualquier decisión posterior sobre titularidad o licencia.</w:t>
       </w:r>
     </w:p>
     <w:p>
@@ -2246,12 +1963,7 @@
         <w:spacing w:after="50" w:line="252" w:lineRule="auto"/>
       </w:pPr>
       <w:r>
-        <w:rPr>
-          <w:rFonts w:ascii="Tahoma" w:hAnsi="Tahoma"/>
-          <w:i w:val="0"/>
-          <w:sz w:val="19"/>
-        </w:rPr>
-        <w:t>Aplicar la decisión técnica acordada: React + TypeScript, Node.js + NestJS, PostgreSQL + pgvector, Jest + Cypress, Docker y Docker Compose, GitHub Actions, Azure OpenAI y despliegue en Azure.</w:t>
+        <w:t>Aplicar la arquitectura definitiva AD-ARQ-001: Next.js/React 19/TypeScript 5.x en Vercel; NestJS 12/Node.js 24 en Azure Container Apps; Supabase PostgreSQL/Auth/Storage/RLS/pgvector; Vercel Sandbox; Azure OpenAI configurable; Docker Compose y Supabase CLI en local; Jest, Cypress y GitHub Actions.</w:t>
       </w:r>
     </w:p>
     <w:p>
@@ -2265,12 +1977,7 @@
         <w:spacing w:after="50" w:line="252" w:lineRule="auto"/>
       </w:pPr>
       <w:r>
-        <w:rPr>
-          <w:rFonts w:ascii="Tahoma" w:hAnsi="Tahoma"/>
-          <w:i w:val="0"/>
-          <w:sz w:val="19"/>
-        </w:rPr>
-        <w:t>Ejecutar y documentar spikes del sandbox JavaScript y del pipeline RAG, con criterios de seguridad, costo y latencia.</w:t>
+        <w:t>Validar y documentar Vercel Sandbox, RLS y el flujo RAG con criterios de seguridad, costo, latencia, región, límites y degradación. La validación produce evidencia operativa y no una nueva selección de proveedor.</w:t>
       </w:r>
     </w:p>
     <w:p>
@@ -2289,12 +1996,7 @@
         <w:spacing w:after="100" w:line="259" w:lineRule="auto"/>
       </w:pPr>
       <w:r>
-        <w:rPr>
-          <w:rFonts w:ascii="Tahoma" w:hAnsi="Tahoma"/>
-          <w:i w:val="0"/>
-          <w:sz w:val="19"/>
-        </w:rPr>
-        <w:t>El Sprint 2 corresponde a las semanas 5-6 y tiene como objetivo entregar la base de plataforma: autenticación segura, roles de profesor y estudiante, creación/configuración de clases e inscripción mediante código. El Sprint Backlog propone 12 tareas y 84 horas. Marcelo Núñez lidera backend e integración; Benjamin Pérez lidera interfaz y documentación; Abraham Retamal lidera datos, calidad y pruebas.</w:t>
+        <w:t>El Sprint 2, planificado para las semanas 5-6, propone entregar la base híbrida: Next.js y previews Vercel; NestJS en Azure Container Apps; Supabase local y administrado con Auth, PostgreSQL/pgvector y RLS; además de organizaciones, usuarios, roles, clases e inscripción. Comprende ALZ-HU-001, ALZ-HU-002, ALZ-HU-003, ALZ-HU-020 y ALZ-HU-021. El Sprint Backlog conserva 12 tareas y 60 horas, distribuidas en 21 para Marcelo, 20 para Abraham y 19 para Benjamin. Marcelo Núñez lidera backend e integración; Benjamin Pérez, interfaz y documentación; Abraham Retamal, datos, IA/RAG, calidad y pruebas.</w:t>
       </w:r>
     </w:p>
     <w:p>
@@ -2308,12 +2010,7 @@
         <w:spacing w:after="50" w:line="252" w:lineRule="auto"/>
       </w:pPr>
       <w:r>
-        <w:rPr>
-          <w:rFonts w:ascii="Tahoma" w:hAnsi="Tahoma"/>
-          <w:i w:val="0"/>
-          <w:sz w:val="19"/>
-        </w:rPr>
-        <w:t>ALZ-HU-001 - Autenticar usuario: modelo de usuarios y roles, sesiones, vistas de acceso y pruebas de autorización (30 h).</w:t>
+        <w:t>ALZ-HU-001 - Acceso y sesión seguros: Autenticación, sesión, autorización por rol y aislamiento por organización; incluye prueba de acceso válido, inválido y no autorizado.</w:t>
       </w:r>
     </w:p>
     <w:p>
@@ -2327,12 +2024,7 @@
         <w:spacing w:after="50" w:line="252" w:lineRule="auto"/>
       </w:pPr>
       <w:r>
-        <w:rPr>
-          <w:rFonts w:ascii="Tahoma" w:hAnsi="Tahoma"/>
-          <w:i w:val="0"/>
-          <w:sz w:val="19"/>
-        </w:rPr>
-        <w:t>ALZ-HU-002 - Administrar clase: dominio, API, interfaz y pruebas de permisos (30 h).</w:t>
+        <w:t>ALZ-HU-020 y ALZ-HU-021 - Gobierno de organizaciones, usuarios y roles: Administración acotada de organizaciones; invitación, activación y deshabilitación de usuarios; asignación de roles con controles de último administrador.</w:t>
       </w:r>
     </w:p>
     <w:p>
@@ -2346,12 +2038,7 @@
         <w:spacing w:after="50" w:line="252" w:lineRule="auto"/>
       </w:pPr>
       <w:r>
-        <w:rPr>
-          <w:rFonts w:ascii="Tahoma" w:hAnsi="Tahoma"/>
-          <w:i w:val="0"/>
-          <w:sz w:val="19"/>
-        </w:rPr>
-        <w:t>ALZ-HU-003 - Inscribirse en clase: códigos, inscripción idempotente, interfaz y pruebas de casos válido, inválido y duplicado (24 h).</w:t>
+        <w:t>ALZ-HU-002 y ALZ-HU-003 - Clase e inscripción: Creación/configuración de clases e inscripción por código, preservando aislamiento y evitando duplicados o códigos inválidos.</w:t>
       </w:r>
     </w:p>
     <w:p>
@@ -2384,12 +2071,20 @@
         <w:spacing w:after="50" w:line="252" w:lineRule="auto"/>
       </w:pPr>
       <w:r>
-        <w:rPr>
-          <w:rFonts w:ascii="Tahoma" w:hAnsi="Tahoma"/>
-          <w:i w:val="0"/>
-          <w:sz w:val="19"/>
-        </w:rPr>
-        <w:t>Seguimiento: registrar diariamente horas consumidas/restantes y actualizar el avance solo con evidencia verificable.</w:t>
+        <w:t>Seguimiento: registrar diariamente horas consumidas y restantes; actualizar avance, velocidad y calidad solo cuando exista evidencia verificable en el repositorio.</w:t>
+      </w:r>
+    </w:p>
+    <w:p>
+      <w:pPr>
+        <w:pStyle w:val="Ttulo1"/>
+      </w:pPr>
+      <w:r>
+        <w:t>Criterio de cierre al 02/09/2026</w:t>
+      </w:r>
+    </w:p>
+    <w:p>
+      <w:r>
+        <w:t>El Sprint 1 se considera cerrado únicamente como hito documental: alcance, requisitos, casos de uso, roles, riesgos y plan de Sprint 2 están registrados. La arquitectura híbrida quedó definida por AD-ARQ-001; los prototipos, la implementación, las pruebas operativas y sus métricas no están acreditados al corte.</w:t>
       </w:r>
     </w:p>
     <w:p>
@@ -2643,6 +2338,8 @@
         <w:tab w:val="clear" w:pos="8640"/>
         <w:tab w:val="right" w:pos="9923"/>
       </w:tabs>
+      <w:spacing w:after="0"/>
+      <w:jc w:val="center"/>
       <w:rPr>
         <w:rFonts w:ascii="Tahoma" w:hAnsi="Tahoma"/>
         <w:lang w:val="fr-FR"/>
@@ -2650,11 +2347,37 @@
     </w:pPr>
     <w:r>
       <w:rPr>
-        <w:noProof/>
-      </w:rPr>
-      <w:tab/>
-      <w:t>Duoc UC, sede Puente Alto | CAPSTONE 2026-2</w:t>
+        <w:color w:val="506476"/>
+        <w:sz w:val="16"/>
+      </w:rPr>
+      <w:t xml:space="preserve">Alunza | Avance Sprint 1 | Corte 02/09/2026 | Página </w:t>
     </w:r>
+    <w:r>
+      <w:fldChar w:fldCharType="begin"/>
+    </w:r>
+    <w:r>
+      <w:instrText xml:space="preserve"> PAGE </w:instrText>
+    </w:r>
+    <w:r>
+      <w:fldChar w:fldCharType="separate"/>
+    </w:r>
+    <w:r>
+      <w:t>1</w:t>
+    </w:r>
+    <w:r>
+      <w:fldChar w:fldCharType="end"/>
+    </w:r>
+    <w:r>
+      <w:rPr>
+        <w:sz w:val="16"/>
+      </w:rPr>
+      <w:t xml:space="preserve"> de </w:t>
+    </w:r>
+    <w:fldSimple w:instr=" NUMPAGES ">
+      <w:r>
+        <w:t>1</w:t>
+      </w:r>
+    </w:fldSimple>
   </w:p>
 </w:ftr>
 </file>
@@ -2705,7 +2428,7 @@
         <wp:inline distT="0" distB="0" distL="0" distR="0" wp14:anchorId="13C4ADBA" wp14:editId="51E650B8">
           <wp:extent cx="2428875" cy="742950"/>
           <wp:effectExtent l="0" t="0" r="0" b="0"/>
-          <wp:docPr id="1" name="Imagen 1"/>
+          <wp:docPr id="1" name="Imagen 1" descr="Logotipo institucional de Duoc UC y la Escuela de Informática y Telecomunicaciones"/>
           <wp:cNvGraphicFramePr>
             <a:graphicFrameLocks xmlns:a="http://schemas.openxmlformats.org/drawingml/2006/main" noChangeAspect="1"/>
           </wp:cNvGraphicFramePr>
@@ -2713,7 +2436,7 @@
             <a:graphicData uri="http://schemas.openxmlformats.org/drawingml/2006/picture">
               <pic:pic xmlns:pic="http://schemas.openxmlformats.org/drawingml/2006/picture">
                 <pic:nvPicPr>
-                  <pic:cNvPr id="0" name="Picture 1"/>
+                  <pic:cNvPr id="0" name="Picture 1" descr="Logotipo institucional de Duoc UC y la Escuela de Informática y Telecomunicaciones"/>
                   <pic:cNvPicPr>
                     <a:picLocks noChangeAspect="1" noChangeArrowheads="1"/>
                   </pic:cNvPicPr>
@@ -2893,6 +2616,9 @@
           </w:r>
         </w:p>
       </w:tc>
+      <w:trPr>
+        <w:tblHeader/>
+      </w:trPr>
     </w:tr>
   </w:tbl>
   <w:p/>

</xml_diff>